<commit_message>
Adding kotlin learning from youtube
</commit_message>
<xml_diff>
--- a/Dokumentasi General Banking BRI 2026.docx
+++ b/Dokumentasi General Banking BRI 2026.docx
@@ -2799,7 +2799,7 @@
               <w:rPr>
                 <w:noProof/>
               </w:rPr>
-              <w:t>21</w:t>
+              <w:t>22</w:t>
             </w:r>
             <w:r>
               <w:rPr>
@@ -2865,7 +2865,7 @@
               <w:rPr>
                 <w:noProof/>
               </w:rPr>
-              <w:t>21</w:t>
+              <w:t>22</w:t>
             </w:r>
             <w:r>
               <w:rPr>
@@ -2931,7 +2931,7 @@
               <w:rPr>
                 <w:noProof/>
               </w:rPr>
-              <w:t>21</w:t>
+              <w:t>22</w:t>
             </w:r>
             <w:r>
               <w:rPr>
@@ -2997,7 +2997,7 @@
               <w:rPr>
                 <w:noProof/>
               </w:rPr>
-              <w:t>21</w:t>
+              <w:t>23</w:t>
             </w:r>
             <w:r>
               <w:rPr>
@@ -3063,7 +3063,7 @@
               <w:rPr>
                 <w:noProof/>
               </w:rPr>
-              <w:t>22</w:t>
+              <w:t>23</w:t>
             </w:r>
             <w:r>
               <w:rPr>
@@ -3129,7 +3129,7 @@
               <w:rPr>
                 <w:noProof/>
               </w:rPr>
-              <w:t>22</w:t>
+              <w:t>23</w:t>
             </w:r>
             <w:r>
               <w:rPr>
@@ -3195,7 +3195,7 @@
               <w:rPr>
                 <w:noProof/>
               </w:rPr>
-              <w:t>23</w:t>
+              <w:t>25</w:t>
             </w:r>
             <w:r>
               <w:rPr>
@@ -3261,7 +3261,7 @@
               <w:rPr>
                 <w:noProof/>
               </w:rPr>
-              <w:t>23</w:t>
+              <w:t>25</w:t>
             </w:r>
             <w:r>
               <w:rPr>
@@ -3327,7 +3327,7 @@
               <w:rPr>
                 <w:noProof/>
               </w:rPr>
-              <w:t>23</w:t>
+              <w:t>25</w:t>
             </w:r>
             <w:r>
               <w:rPr>
@@ -3393,7 +3393,7 @@
               <w:rPr>
                 <w:noProof/>
               </w:rPr>
-              <w:t>23</w:t>
+              <w:t>25</w:t>
             </w:r>
             <w:r>
               <w:rPr>
@@ -3459,7 +3459,7 @@
               <w:rPr>
                 <w:noProof/>
               </w:rPr>
-              <w:t>25</w:t>
+              <w:t>27</w:t>
             </w:r>
             <w:r>
               <w:rPr>
@@ -3525,7 +3525,7 @@
               <w:rPr>
                 <w:noProof/>
               </w:rPr>
-              <w:t>25</w:t>
+              <w:t>27</w:t>
             </w:r>
             <w:r>
               <w:rPr>
@@ -3591,7 +3591,7 @@
               <w:rPr>
                 <w:noProof/>
               </w:rPr>
-              <w:t>25</w:t>
+              <w:t>27</w:t>
             </w:r>
             <w:r>
               <w:rPr>
@@ -3657,7 +3657,7 @@
               <w:rPr>
                 <w:noProof/>
               </w:rPr>
-              <w:t>25</w:t>
+              <w:t>27</w:t>
             </w:r>
             <w:r>
               <w:rPr>
@@ -3723,7 +3723,7 @@
               <w:rPr>
                 <w:noProof/>
               </w:rPr>
-              <w:t>27</w:t>
+              <w:t>29</w:t>
             </w:r>
             <w:r>
               <w:rPr>
@@ -3789,7 +3789,7 @@
               <w:rPr>
                 <w:noProof/>
               </w:rPr>
-              <w:t>27</w:t>
+              <w:t>29</w:t>
             </w:r>
             <w:r>
               <w:rPr>
@@ -3855,7 +3855,7 @@
               <w:rPr>
                 <w:noProof/>
               </w:rPr>
-              <w:t>28</w:t>
+              <w:t>29</w:t>
             </w:r>
             <w:r>
               <w:rPr>
@@ -3921,7 +3921,7 @@
               <w:rPr>
                 <w:noProof/>
               </w:rPr>
-              <w:t>28</w:t>
+              <w:t>30</w:t>
             </w:r>
             <w:r>
               <w:rPr>
@@ -3987,7 +3987,7 @@
               <w:rPr>
                 <w:noProof/>
               </w:rPr>
-              <w:t>29</w:t>
+              <w:t>31</w:t>
             </w:r>
             <w:r>
               <w:rPr>
@@ -4053,7 +4053,7 @@
               <w:rPr>
                 <w:noProof/>
               </w:rPr>
-              <w:t>31</w:t>
+              <w:t>33</w:t>
             </w:r>
             <w:r>
               <w:rPr>
@@ -22204,15 +22204,7 @@
                 <w:sz w:val="20"/>
                 <w:szCs w:val="20"/>
               </w:rPr>
-              <w:t>N</w:t>
-            </w:r>
-            <w:r>
-              <w:rPr>
-                <w:rFonts w:ascii="Times New Roman" w:eastAsia="Times New Roman" w:hAnsi="Times New Roman" w:cs="Times New Roman"/>
-                <w:sz w:val="20"/>
-                <w:szCs w:val="20"/>
-              </w:rPr>
-              <w:t xml:space="preserve">ilai aset berubah </w:t>
+              <w:t xml:space="preserve">Nilai aset berubah </w:t>
             </w:r>
           </w:p>
           <w:p>
@@ -23962,6 +23954,738 @@
         <w:spacing w:before="60" w:after="60"/>
       </w:pPr>
     </w:p>
+    <w:tbl>
+      <w:tblPr>
+        <w:tblW w:w="9376" w:type="dxa"/>
+        <w:tblBorders>
+          <w:top w:val="single" w:sz="4" w:space="0" w:color="auto"/>
+          <w:left w:val="single" w:sz="4" w:space="0" w:color="auto"/>
+          <w:bottom w:val="single" w:sz="4" w:space="0" w:color="auto"/>
+          <w:right w:val="single" w:sz="4" w:space="0" w:color="auto"/>
+          <w:insideH w:val="single" w:sz="4" w:space="0" w:color="auto"/>
+          <w:insideV w:val="single" w:sz="4" w:space="0" w:color="auto"/>
+        </w:tblBorders>
+        <w:tblCellMar>
+          <w:left w:w="10" w:type="dxa"/>
+          <w:right w:w="10" w:type="dxa"/>
+        </w:tblCellMar>
+        <w:tblLook w:val="0000" w:firstRow="0" w:lastRow="0" w:firstColumn="0" w:lastColumn="0" w:noHBand="0" w:noVBand="0"/>
+      </w:tblPr>
+      <w:tblGrid>
+        <w:gridCol w:w="2074"/>
+        <w:gridCol w:w="3349"/>
+        <w:gridCol w:w="3953"/>
+      </w:tblGrid>
+      <w:tr>
+        <w:trPr>
+          <w:tblHeader/>
+        </w:trPr>
+        <w:tc>
+          <w:tcPr>
+            <w:tcW w:w="2074" w:type="dxa"/>
+            <w:tcBorders>
+              <w:top w:val="single" w:sz="4" w:space="0" w:color="CCCCCC"/>
+              <w:left w:val="single" w:sz="4" w:space="0" w:color="CCCCCC"/>
+              <w:bottom w:val="single" w:sz="4" w:space="0" w:color="CCCCCC"/>
+              <w:right w:val="single" w:sz="4" w:space="0" w:color="CCCCCC"/>
+            </w:tcBorders>
+            <w:shd w:val="clear" w:color="auto" w:fill="1A3A6B"/>
+            <w:tcMar>
+              <w:top w:w="100" w:type="dxa"/>
+              <w:left w:w="140" w:type="dxa"/>
+              <w:bottom w:w="100" w:type="dxa"/>
+              <w:right w:w="140" w:type="dxa"/>
+            </w:tcMar>
+          </w:tcPr>
+          <w:p>
+            <w:pPr>
+              <w:jc w:val="center"/>
+              <w:rPr>
+                <w:sz w:val="20"/>
+                <w:szCs w:val="20"/>
+              </w:rPr>
+            </w:pPr>
+            <w:r>
+              <w:rPr>
+                <w:b/>
+                <w:bCs/>
+                <w:color w:val="FFFFFF"/>
+                <w:sz w:val="20"/>
+                <w:szCs w:val="20"/>
+              </w:rPr>
+              <w:t>Aspek</w:t>
+            </w:r>
+          </w:p>
+        </w:tc>
+        <w:tc>
+          <w:tcPr>
+            <w:tcW w:w="3349" w:type="dxa"/>
+            <w:tcBorders>
+              <w:top w:val="single" w:sz="4" w:space="0" w:color="CCCCCC"/>
+              <w:left w:val="single" w:sz="4" w:space="0" w:color="CCCCCC"/>
+              <w:bottom w:val="single" w:sz="4" w:space="0" w:color="CCCCCC"/>
+              <w:right w:val="single" w:sz="4" w:space="0" w:color="CCCCCC"/>
+            </w:tcBorders>
+            <w:shd w:val="clear" w:color="auto" w:fill="1A3A6B"/>
+          </w:tcPr>
+          <w:p>
+            <w:pPr>
+              <w:jc w:val="center"/>
+              <w:rPr>
+                <w:b/>
+                <w:bCs/>
+                <w:color w:val="FFFFFF"/>
+                <w:sz w:val="20"/>
+                <w:szCs w:val="20"/>
+              </w:rPr>
+            </w:pPr>
+            <w:r>
+              <w:rPr>
+                <w:b/>
+                <w:bCs/>
+                <w:color w:val="FFFFFF"/>
+                <w:sz w:val="20"/>
+                <w:szCs w:val="20"/>
+              </w:rPr>
+              <w:t>BRI Prioritas</w:t>
+            </w:r>
+          </w:p>
+        </w:tc>
+        <w:tc>
+          <w:tcPr>
+            <w:tcW w:w="3953" w:type="dxa"/>
+            <w:tcBorders>
+              <w:top w:val="single" w:sz="4" w:space="0" w:color="CCCCCC"/>
+              <w:left w:val="single" w:sz="4" w:space="0" w:color="CCCCCC"/>
+              <w:bottom w:val="single" w:sz="4" w:space="0" w:color="CCCCCC"/>
+              <w:right w:val="single" w:sz="4" w:space="0" w:color="CCCCCC"/>
+            </w:tcBorders>
+            <w:shd w:val="clear" w:color="auto" w:fill="1A3A6B"/>
+            <w:tcMar>
+              <w:top w:w="100" w:type="dxa"/>
+              <w:left w:w="140" w:type="dxa"/>
+              <w:bottom w:w="100" w:type="dxa"/>
+              <w:right w:w="140" w:type="dxa"/>
+            </w:tcMar>
+          </w:tcPr>
+          <w:p>
+            <w:pPr>
+              <w:jc w:val="center"/>
+              <w:rPr>
+                <w:sz w:val="20"/>
+                <w:szCs w:val="20"/>
+              </w:rPr>
+            </w:pPr>
+            <w:r>
+              <w:rPr>
+                <w:b/>
+                <w:bCs/>
+                <w:color w:val="FFFFFF"/>
+                <w:sz w:val="20"/>
+                <w:szCs w:val="20"/>
+              </w:rPr>
+              <w:t>BRI Private</w:t>
+            </w:r>
+          </w:p>
+        </w:tc>
+      </w:tr>
+      <w:tr>
+        <w:tc>
+          <w:tcPr>
+            <w:tcW w:w="2074" w:type="dxa"/>
+            <w:tcBorders>
+              <w:top w:val="single" w:sz="4" w:space="0" w:color="CCCCCC"/>
+              <w:left w:val="single" w:sz="4" w:space="0" w:color="CCCCCC"/>
+              <w:bottom w:val="single" w:sz="4" w:space="0" w:color="CCCCCC"/>
+              <w:right w:val="single" w:sz="4" w:space="0" w:color="CCCCCC"/>
+            </w:tcBorders>
+            <w:shd w:val="clear" w:color="auto" w:fill="FFFFFF"/>
+            <w:tcMar>
+              <w:top w:w="80" w:type="dxa"/>
+              <w:left w:w="140" w:type="dxa"/>
+              <w:bottom w:w="80" w:type="dxa"/>
+              <w:right w:w="140" w:type="dxa"/>
+            </w:tcMar>
+          </w:tcPr>
+          <w:p>
+            <w:pPr>
+              <w:rPr>
+                <w:sz w:val="20"/>
+                <w:szCs w:val="20"/>
+              </w:rPr>
+            </w:pPr>
+            <w:r>
+              <w:rPr>
+                <w:sz w:val="20"/>
+                <w:szCs w:val="20"/>
+              </w:rPr>
+              <w:t>Target nasabah</w:t>
+            </w:r>
+          </w:p>
+        </w:tc>
+        <w:tc>
+          <w:tcPr>
+            <w:tcW w:w="3349" w:type="dxa"/>
+            <w:tcBorders>
+              <w:top w:val="single" w:sz="4" w:space="0" w:color="CCCCCC"/>
+              <w:left w:val="single" w:sz="4" w:space="0" w:color="CCCCCC"/>
+              <w:bottom w:val="single" w:sz="4" w:space="0" w:color="CCCCCC"/>
+              <w:right w:val="single" w:sz="4" w:space="0" w:color="CCCCCC"/>
+            </w:tcBorders>
+            <w:shd w:val="clear" w:color="auto" w:fill="FFFFFF"/>
+          </w:tcPr>
+          <w:p>
+            <w:pPr>
+              <w:tabs>
+                <w:tab w:val="left" w:pos="2120"/>
+              </w:tabs>
+              <w:rPr>
+                <w:sz w:val="20"/>
+                <w:szCs w:val="20"/>
+              </w:rPr>
+            </w:pPr>
+            <w:r>
+              <w:rPr>
+                <w:sz w:val="20"/>
+                <w:szCs w:val="20"/>
+              </w:rPr>
+              <w:t>High Net Worth (HNW)</w:t>
+            </w:r>
+          </w:p>
+        </w:tc>
+        <w:tc>
+          <w:tcPr>
+            <w:tcW w:w="3953" w:type="dxa"/>
+            <w:tcBorders>
+              <w:top w:val="single" w:sz="4" w:space="0" w:color="CCCCCC"/>
+              <w:left w:val="single" w:sz="4" w:space="0" w:color="CCCCCC"/>
+              <w:bottom w:val="single" w:sz="4" w:space="0" w:color="CCCCCC"/>
+              <w:right w:val="single" w:sz="4" w:space="0" w:color="CCCCCC"/>
+            </w:tcBorders>
+            <w:shd w:val="clear" w:color="auto" w:fill="FFFFFF"/>
+            <w:tcMar>
+              <w:top w:w="80" w:type="dxa"/>
+              <w:left w:w="140" w:type="dxa"/>
+              <w:bottom w:w="80" w:type="dxa"/>
+              <w:right w:w="140" w:type="dxa"/>
+            </w:tcMar>
+          </w:tcPr>
+          <w:p>
+            <w:pPr>
+              <w:rPr>
+                <w:sz w:val="20"/>
+                <w:szCs w:val="20"/>
+              </w:rPr>
+            </w:pPr>
+            <w:r>
+              <w:rPr>
+                <w:sz w:val="20"/>
+                <w:szCs w:val="20"/>
+              </w:rPr>
+              <w:t>Ultra High Net Worth (UHNW)</w:t>
+            </w:r>
+          </w:p>
+        </w:tc>
+      </w:tr>
+      <w:tr>
+        <w:tc>
+          <w:tcPr>
+            <w:tcW w:w="2074" w:type="dxa"/>
+            <w:tcBorders>
+              <w:top w:val="single" w:sz="4" w:space="0" w:color="CCCCCC"/>
+              <w:left w:val="single" w:sz="4" w:space="0" w:color="CCCCCC"/>
+              <w:bottom w:val="single" w:sz="4" w:space="0" w:color="CCCCCC"/>
+              <w:right w:val="single" w:sz="4" w:space="0" w:color="CCCCCC"/>
+            </w:tcBorders>
+            <w:shd w:val="clear" w:color="auto" w:fill="EEF4FB"/>
+            <w:tcMar>
+              <w:top w:w="80" w:type="dxa"/>
+              <w:left w:w="140" w:type="dxa"/>
+              <w:bottom w:w="80" w:type="dxa"/>
+              <w:right w:w="140" w:type="dxa"/>
+            </w:tcMar>
+          </w:tcPr>
+          <w:p>
+            <w:pPr>
+              <w:rPr>
+                <w:sz w:val="20"/>
+                <w:szCs w:val="20"/>
+              </w:rPr>
+            </w:pPr>
+            <w:r>
+              <w:rPr>
+                <w:sz w:val="20"/>
+                <w:szCs w:val="20"/>
+              </w:rPr>
+              <w:t>Minimum dana</w:t>
+            </w:r>
+          </w:p>
+        </w:tc>
+        <w:tc>
+          <w:tcPr>
+            <w:tcW w:w="3349" w:type="dxa"/>
+            <w:tcBorders>
+              <w:top w:val="single" w:sz="4" w:space="0" w:color="CCCCCC"/>
+              <w:left w:val="single" w:sz="4" w:space="0" w:color="CCCCCC"/>
+              <w:bottom w:val="single" w:sz="4" w:space="0" w:color="CCCCCC"/>
+              <w:right w:val="single" w:sz="4" w:space="0" w:color="CCCCCC"/>
+            </w:tcBorders>
+            <w:shd w:val="clear" w:color="auto" w:fill="EEF4FB"/>
+          </w:tcPr>
+          <w:p>
+            <w:pPr>
+              <w:rPr>
+                <w:sz w:val="20"/>
+                <w:szCs w:val="20"/>
+              </w:rPr>
+            </w:pPr>
+            <w:r>
+              <w:rPr>
+                <w:sz w:val="20"/>
+                <w:szCs w:val="20"/>
+              </w:rPr>
+              <w:t>± ≥ 500 juta – 1 M</w:t>
+            </w:r>
+          </w:p>
+        </w:tc>
+        <w:tc>
+          <w:tcPr>
+            <w:tcW w:w="3953" w:type="dxa"/>
+            <w:tcBorders>
+              <w:top w:val="single" w:sz="4" w:space="0" w:color="CCCCCC"/>
+              <w:left w:val="single" w:sz="4" w:space="0" w:color="CCCCCC"/>
+              <w:bottom w:val="single" w:sz="4" w:space="0" w:color="CCCCCC"/>
+              <w:right w:val="single" w:sz="4" w:space="0" w:color="CCCCCC"/>
+            </w:tcBorders>
+            <w:shd w:val="clear" w:color="auto" w:fill="EEF4FB"/>
+            <w:tcMar>
+              <w:top w:w="80" w:type="dxa"/>
+              <w:left w:w="140" w:type="dxa"/>
+              <w:bottom w:w="80" w:type="dxa"/>
+              <w:right w:w="140" w:type="dxa"/>
+            </w:tcMar>
+          </w:tcPr>
+          <w:p>
+            <w:pPr>
+              <w:rPr>
+                <w:sz w:val="20"/>
+                <w:szCs w:val="20"/>
+              </w:rPr>
+            </w:pPr>
+            <w:r>
+              <w:rPr>
+                <w:sz w:val="20"/>
+                <w:szCs w:val="20"/>
+              </w:rPr>
+              <w:t>± ≥ 5 M – 10 M+</w:t>
+            </w:r>
+          </w:p>
+        </w:tc>
+      </w:tr>
+      <w:tr>
+        <w:tc>
+          <w:tcPr>
+            <w:tcW w:w="2074" w:type="dxa"/>
+            <w:tcBorders>
+              <w:top w:val="single" w:sz="4" w:space="0" w:color="CCCCCC"/>
+              <w:left w:val="single" w:sz="4" w:space="0" w:color="CCCCCC"/>
+              <w:bottom w:val="single" w:sz="4" w:space="0" w:color="CCCCCC"/>
+              <w:right w:val="single" w:sz="4" w:space="0" w:color="CCCCCC"/>
+            </w:tcBorders>
+            <w:shd w:val="clear" w:color="auto" w:fill="FFFFFF"/>
+            <w:tcMar>
+              <w:top w:w="80" w:type="dxa"/>
+              <w:left w:w="140" w:type="dxa"/>
+              <w:bottom w:w="80" w:type="dxa"/>
+              <w:right w:w="140" w:type="dxa"/>
+            </w:tcMar>
+          </w:tcPr>
+          <w:p>
+            <w:pPr>
+              <w:rPr>
+                <w:sz w:val="20"/>
+                <w:szCs w:val="20"/>
+              </w:rPr>
+            </w:pPr>
+            <w:r>
+              <w:rPr>
+                <w:sz w:val="20"/>
+                <w:szCs w:val="20"/>
+              </w:rPr>
+              <w:t>Fokus layanan</w:t>
+            </w:r>
+          </w:p>
+        </w:tc>
+        <w:tc>
+          <w:tcPr>
+            <w:tcW w:w="3349" w:type="dxa"/>
+            <w:tcBorders>
+              <w:top w:val="single" w:sz="4" w:space="0" w:color="CCCCCC"/>
+              <w:left w:val="single" w:sz="4" w:space="0" w:color="CCCCCC"/>
+              <w:bottom w:val="single" w:sz="4" w:space="0" w:color="CCCCCC"/>
+              <w:right w:val="single" w:sz="4" w:space="0" w:color="CCCCCC"/>
+            </w:tcBorders>
+            <w:shd w:val="clear" w:color="auto" w:fill="FFFFFF"/>
+          </w:tcPr>
+          <w:p>
+            <w:pPr>
+              <w:rPr>
+                <w:sz w:val="20"/>
+                <w:szCs w:val="20"/>
+              </w:rPr>
+            </w:pPr>
+            <w:r>
+              <w:rPr>
+                <w:sz w:val="20"/>
+                <w:szCs w:val="20"/>
+              </w:rPr>
+              <w:t>Kenyamanan &amp; produk banking</w:t>
+            </w:r>
+          </w:p>
+        </w:tc>
+        <w:tc>
+          <w:tcPr>
+            <w:tcW w:w="3953" w:type="dxa"/>
+            <w:tcBorders>
+              <w:top w:val="single" w:sz="4" w:space="0" w:color="CCCCCC"/>
+              <w:left w:val="single" w:sz="4" w:space="0" w:color="CCCCCC"/>
+              <w:bottom w:val="single" w:sz="4" w:space="0" w:color="CCCCCC"/>
+              <w:right w:val="single" w:sz="4" w:space="0" w:color="CCCCCC"/>
+            </w:tcBorders>
+            <w:shd w:val="clear" w:color="auto" w:fill="FFFFFF"/>
+            <w:tcMar>
+              <w:top w:w="80" w:type="dxa"/>
+              <w:left w:w="140" w:type="dxa"/>
+              <w:bottom w:w="80" w:type="dxa"/>
+              <w:right w:w="140" w:type="dxa"/>
+            </w:tcMar>
+          </w:tcPr>
+          <w:p>
+            <w:pPr>
+              <w:rPr>
+                <w:sz w:val="20"/>
+                <w:szCs w:val="20"/>
+              </w:rPr>
+            </w:pPr>
+            <w:r>
+              <w:rPr>
+                <w:sz w:val="20"/>
+                <w:szCs w:val="20"/>
+              </w:rPr>
+              <w:t>Wealth management &amp; investasi kompleks</w:t>
+            </w:r>
+          </w:p>
+        </w:tc>
+      </w:tr>
+      <w:tr>
+        <w:tc>
+          <w:tcPr>
+            <w:tcW w:w="2074" w:type="dxa"/>
+            <w:tcBorders>
+              <w:top w:val="single" w:sz="4" w:space="0" w:color="CCCCCC"/>
+              <w:left w:val="single" w:sz="4" w:space="0" w:color="CCCCCC"/>
+              <w:bottom w:val="single" w:sz="4" w:space="0" w:color="CCCCCC"/>
+              <w:right w:val="single" w:sz="4" w:space="0" w:color="CCCCCC"/>
+            </w:tcBorders>
+            <w:shd w:val="clear" w:color="auto" w:fill="EEF4FB"/>
+            <w:tcMar>
+              <w:top w:w="80" w:type="dxa"/>
+              <w:left w:w="140" w:type="dxa"/>
+              <w:bottom w:w="80" w:type="dxa"/>
+              <w:right w:w="140" w:type="dxa"/>
+            </w:tcMar>
+          </w:tcPr>
+          <w:p>
+            <w:pPr>
+              <w:rPr>
+                <w:sz w:val="20"/>
+                <w:szCs w:val="20"/>
+              </w:rPr>
+            </w:pPr>
+            <w:r>
+              <w:rPr>
+                <w:sz w:val="20"/>
+                <w:szCs w:val="20"/>
+              </w:rPr>
+              <w:t>Relationship Manager</w:t>
+            </w:r>
+          </w:p>
+        </w:tc>
+        <w:tc>
+          <w:tcPr>
+            <w:tcW w:w="3349" w:type="dxa"/>
+            <w:tcBorders>
+              <w:top w:val="single" w:sz="4" w:space="0" w:color="CCCCCC"/>
+              <w:left w:val="single" w:sz="4" w:space="0" w:color="CCCCCC"/>
+              <w:bottom w:val="single" w:sz="4" w:space="0" w:color="CCCCCC"/>
+              <w:right w:val="single" w:sz="4" w:space="0" w:color="CCCCCC"/>
+            </w:tcBorders>
+            <w:shd w:val="clear" w:color="auto" w:fill="EEF4FB"/>
+          </w:tcPr>
+          <w:p>
+            <w:pPr>
+              <w:rPr>
+                <w:sz w:val="20"/>
+                <w:szCs w:val="20"/>
+              </w:rPr>
+            </w:pPr>
+            <w:r>
+              <w:rPr>
+                <w:sz w:val="20"/>
+                <w:szCs w:val="20"/>
+              </w:rPr>
+              <w:t>Ada</w:t>
+            </w:r>
+          </w:p>
+          <w:p>
+            <w:pPr>
+              <w:tabs>
+                <w:tab w:val="left" w:pos="980"/>
+              </w:tabs>
+              <w:rPr>
+                <w:sz w:val="20"/>
+                <w:szCs w:val="20"/>
+              </w:rPr>
+            </w:pPr>
+            <w:r>
+              <w:rPr>
+                <w:sz w:val="20"/>
+                <w:szCs w:val="20"/>
+              </w:rPr>
+              <w:tab/>
+            </w:r>
+          </w:p>
+        </w:tc>
+        <w:tc>
+          <w:tcPr>
+            <w:tcW w:w="3953" w:type="dxa"/>
+            <w:tcBorders>
+              <w:top w:val="single" w:sz="4" w:space="0" w:color="CCCCCC"/>
+              <w:left w:val="single" w:sz="4" w:space="0" w:color="CCCCCC"/>
+              <w:bottom w:val="single" w:sz="4" w:space="0" w:color="CCCCCC"/>
+              <w:right w:val="single" w:sz="4" w:space="0" w:color="CCCCCC"/>
+            </w:tcBorders>
+            <w:shd w:val="clear" w:color="auto" w:fill="EEF4FB"/>
+            <w:tcMar>
+              <w:top w:w="80" w:type="dxa"/>
+              <w:left w:w="140" w:type="dxa"/>
+              <w:bottom w:w="80" w:type="dxa"/>
+              <w:right w:w="140" w:type="dxa"/>
+            </w:tcMar>
+          </w:tcPr>
+          <w:p>
+            <w:pPr>
+              <w:rPr>
+                <w:sz w:val="20"/>
+                <w:szCs w:val="20"/>
+              </w:rPr>
+            </w:pPr>
+            <w:r>
+              <w:rPr>
+                <w:sz w:val="20"/>
+                <w:szCs w:val="20"/>
+              </w:rPr>
+              <w:t>Dedicated &amp; lebih eksklusif</w:t>
+            </w:r>
+          </w:p>
+        </w:tc>
+      </w:tr>
+      <w:tr>
+        <w:tc>
+          <w:tcPr>
+            <w:tcW w:w="2074" w:type="dxa"/>
+            <w:tcBorders>
+              <w:top w:val="single" w:sz="4" w:space="0" w:color="CCCCCC"/>
+              <w:left w:val="single" w:sz="4" w:space="0" w:color="CCCCCC"/>
+              <w:bottom w:val="single" w:sz="4" w:space="0" w:color="CCCCCC"/>
+              <w:right w:val="single" w:sz="4" w:space="0" w:color="CCCCCC"/>
+            </w:tcBorders>
+            <w:shd w:val="clear" w:color="auto" w:fill="FFFFFF"/>
+            <w:tcMar>
+              <w:top w:w="80" w:type="dxa"/>
+              <w:left w:w="140" w:type="dxa"/>
+              <w:bottom w:w="80" w:type="dxa"/>
+              <w:right w:w="140" w:type="dxa"/>
+            </w:tcMar>
+          </w:tcPr>
+          <w:p>
+            <w:pPr>
+              <w:rPr>
+                <w:sz w:val="20"/>
+                <w:szCs w:val="20"/>
+              </w:rPr>
+            </w:pPr>
+            <w:r>
+              <w:rPr>
+                <w:sz w:val="20"/>
+                <w:szCs w:val="20"/>
+              </w:rPr>
+              <w:t>Produk</w:t>
+            </w:r>
+          </w:p>
+        </w:tc>
+        <w:tc>
+          <w:tcPr>
+            <w:tcW w:w="3349" w:type="dxa"/>
+            <w:tcBorders>
+              <w:top w:val="single" w:sz="4" w:space="0" w:color="CCCCCC"/>
+              <w:left w:val="single" w:sz="4" w:space="0" w:color="CCCCCC"/>
+              <w:bottom w:val="single" w:sz="4" w:space="0" w:color="CCCCCC"/>
+              <w:right w:val="single" w:sz="4" w:space="0" w:color="CCCCCC"/>
+            </w:tcBorders>
+            <w:shd w:val="clear" w:color="auto" w:fill="FFFFFF"/>
+          </w:tcPr>
+          <w:p>
+            <w:pPr>
+              <w:rPr>
+                <w:sz w:val="20"/>
+                <w:szCs w:val="20"/>
+              </w:rPr>
+            </w:pPr>
+            <w:r>
+              <w:rPr>
+                <w:sz w:val="20"/>
+                <w:szCs w:val="20"/>
+              </w:rPr>
+              <w:t>Tabungan, deposito, reksa dana</w:t>
+            </w:r>
+          </w:p>
+        </w:tc>
+        <w:tc>
+          <w:tcPr>
+            <w:tcW w:w="3953" w:type="dxa"/>
+            <w:tcBorders>
+              <w:top w:val="single" w:sz="4" w:space="0" w:color="CCCCCC"/>
+              <w:left w:val="single" w:sz="4" w:space="0" w:color="CCCCCC"/>
+              <w:bottom w:val="single" w:sz="4" w:space="0" w:color="CCCCCC"/>
+              <w:right w:val="single" w:sz="4" w:space="0" w:color="CCCCCC"/>
+            </w:tcBorders>
+            <w:shd w:val="clear" w:color="auto" w:fill="FFFFFF"/>
+            <w:tcMar>
+              <w:top w:w="80" w:type="dxa"/>
+              <w:left w:w="140" w:type="dxa"/>
+              <w:bottom w:w="80" w:type="dxa"/>
+              <w:right w:w="140" w:type="dxa"/>
+            </w:tcMar>
+          </w:tcPr>
+          <w:p>
+            <w:pPr>
+              <w:rPr>
+                <w:sz w:val="20"/>
+                <w:szCs w:val="20"/>
+              </w:rPr>
+            </w:pPr>
+            <w:r>
+              <w:rPr>
+                <w:sz w:val="20"/>
+                <w:szCs w:val="20"/>
+              </w:rPr>
+              <w:t>Portfolio investasi, advisory, wealth planning</w:t>
+            </w:r>
+          </w:p>
+        </w:tc>
+      </w:tr>
+      <w:tr>
+        <w:tc>
+          <w:tcPr>
+            <w:tcW w:w="2074" w:type="dxa"/>
+            <w:tcBorders>
+              <w:top w:val="single" w:sz="4" w:space="0" w:color="CCCCCC"/>
+              <w:left w:val="single" w:sz="4" w:space="0" w:color="CCCCCC"/>
+              <w:bottom w:val="single" w:sz="4" w:space="0" w:color="CCCCCC"/>
+              <w:right w:val="single" w:sz="4" w:space="0" w:color="CCCCCC"/>
+            </w:tcBorders>
+            <w:shd w:val="clear" w:color="auto" w:fill="EEF4FB"/>
+            <w:tcMar>
+              <w:top w:w="80" w:type="dxa"/>
+              <w:left w:w="140" w:type="dxa"/>
+              <w:bottom w:w="80" w:type="dxa"/>
+              <w:right w:w="140" w:type="dxa"/>
+            </w:tcMar>
+          </w:tcPr>
+          <w:p>
+            <w:pPr>
+              <w:rPr>
+                <w:sz w:val="20"/>
+                <w:szCs w:val="20"/>
+              </w:rPr>
+            </w:pPr>
+            <w:r>
+              <w:rPr>
+                <w:sz w:val="20"/>
+                <w:szCs w:val="20"/>
+              </w:rPr>
+              <w:t>Akses</w:t>
+            </w:r>
+          </w:p>
+        </w:tc>
+        <w:tc>
+          <w:tcPr>
+            <w:tcW w:w="3349" w:type="dxa"/>
+            <w:tcBorders>
+              <w:top w:val="single" w:sz="4" w:space="0" w:color="CCCCCC"/>
+              <w:left w:val="single" w:sz="4" w:space="0" w:color="CCCCCC"/>
+              <w:bottom w:val="single" w:sz="4" w:space="0" w:color="CCCCCC"/>
+              <w:right w:val="single" w:sz="4" w:space="0" w:color="CCCCCC"/>
+            </w:tcBorders>
+            <w:shd w:val="clear" w:color="auto" w:fill="EEF4FB"/>
+          </w:tcPr>
+          <w:p>
+            <w:pPr>
+              <w:rPr>
+                <w:sz w:val="20"/>
+                <w:szCs w:val="20"/>
+              </w:rPr>
+            </w:pPr>
+            <w:r>
+              <w:rPr>
+                <w:sz w:val="20"/>
+                <w:szCs w:val="20"/>
+              </w:rPr>
+              <w:t>Lounge prioritas</w:t>
+            </w:r>
+          </w:p>
+        </w:tc>
+        <w:tc>
+          <w:tcPr>
+            <w:tcW w:w="3953" w:type="dxa"/>
+            <w:tcBorders>
+              <w:top w:val="single" w:sz="4" w:space="0" w:color="CCCCCC"/>
+              <w:left w:val="single" w:sz="4" w:space="0" w:color="CCCCCC"/>
+              <w:bottom w:val="single" w:sz="4" w:space="0" w:color="CCCCCC"/>
+              <w:right w:val="single" w:sz="4" w:space="0" w:color="CCCCCC"/>
+            </w:tcBorders>
+            <w:shd w:val="clear" w:color="auto" w:fill="EEF4FB"/>
+            <w:tcMar>
+              <w:top w:w="80" w:type="dxa"/>
+              <w:left w:w="140" w:type="dxa"/>
+              <w:bottom w:w="80" w:type="dxa"/>
+              <w:right w:w="140" w:type="dxa"/>
+            </w:tcMar>
+          </w:tcPr>
+          <w:p>
+            <w:pPr>
+              <w:rPr>
+                <w:sz w:val="20"/>
+                <w:szCs w:val="20"/>
+              </w:rPr>
+            </w:pPr>
+            <w:r>
+              <w:rPr>
+                <w:sz w:val="20"/>
+                <w:szCs w:val="20"/>
+              </w:rPr>
+              <w:t>Private service (lebih eksklusif &amp; personal)</w:t>
+            </w:r>
+          </w:p>
+        </w:tc>
+      </w:tr>
+    </w:tbl>
+    <w:p>
+      <w:pPr>
+        <w:spacing w:before="60" w:after="60"/>
+      </w:pPr>
+    </w:p>
     <w:p>
       <w:pPr>
         <w:pStyle w:val="Heading2"/>
@@ -24396,7 +25120,6 @@
         <w:rPr>
           <w:color w:val="2C2C2C"/>
         </w:rPr>
-        <w:lastRenderedPageBreak/>
         <w:t>Internet banking BRI dapat diakses melalui browser web di ib.bri.co.id. Layanan ini memiliki limit transaksi yang lebih besar dibandingkan BRImo, cocok untuk kebutuhan bisnis dan korporat.</w:t>
       </w:r>
     </w:p>
@@ -25121,6 +25844,7 @@
                 <w:sz w:val="20"/>
                 <w:szCs w:val="20"/>
               </w:rPr>
+              <w:lastRenderedPageBreak/>
               <w:t>SLIK OJK</w:t>
             </w:r>
           </w:p>

</xml_diff>